<commit_message>
feat: publica links comerciais e portfolio de modelo
</commit_message>
<xml_diff>
--- a/public/Igor_de_Castro_Resume_EN_2026.docx
+++ b/public/Igor_de_Castro_Resume_EN_2026.docx
@@ -210,16 +210,8 @@
           <w:rPr>
             <w:color w:val="64748A"/>
           </w:rPr>
-          <w:t>linkedin.com/in/</w:t>
+          <w:t>linkedin.com/in/igor-cferreira</w:t>
         </w:r>
-        <w:proofErr w:type="spellStart"/>
-        <w:r>
-          <w:rPr>
-            <w:color w:val="64748A"/>
-          </w:rPr>
-          <w:t>igor-cferreira</w:t>
-        </w:r>
-        <w:proofErr w:type="spellEnd"/>
       </w:hyperlink>
       <w:r>
         <w:rPr>
@@ -246,16 +238,8 @@
           <w:rPr>
             <w:color w:val="64748A"/>
           </w:rPr>
-          <w:t>github.com/</w:t>
+          <w:t>github.com/Igorpcferreira</w:t>
         </w:r>
-        <w:proofErr w:type="spellStart"/>
-        <w:r>
-          <w:rPr>
-            <w:color w:val="64748A"/>
-          </w:rPr>
-          <w:t>Igorpcferreira</w:t>
-        </w:r>
-        <w:proofErr w:type="spellEnd"/>
       </w:hyperlink>
       <w:r>
         <w:rPr>
@@ -363,7 +347,7 @@
           </mc:Choice>
           <mc:Fallback>
             <w:pict>
-              <v:shape w14:anchorId="65D94D98" id="Graphic 6" o:spid="_x0000_s1026" style="position:absolute;margin-left:55.6pt;margin-top:23.95pt;width:484.1pt;height:.1pt;z-index:-15728640;visibility:visible;mso-wrap-style:square;mso-wrap-distance-left:0;mso-wrap-distance-top:0;mso-wrap-distance-right:0;mso-wrap-distance-bottom:0;mso-position-horizontal:absolute;mso-position-horizontal-relative:page;mso-position-vertical:absolute;mso-position-vertical-relative:text;v-text-anchor:top" coordsize="6148070,1270" o:gfxdata="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" path="m,l6147600,e" filled="f" strokecolor="#cad4e1" strokeweight=".65pt">
+              <v:shape w14:anchorId="65D94D98" id="Graphic 6" o:spid="_x0000_s1026" style="position:absolute;margin-left:55.6pt;margin-top:23.95pt;width:484.1pt;height:.1pt;z-index:-15728640;visibility:visible;mso-wrap-style:square;mso-wrap-distance-left:0;mso-wrap-distance-top:0;mso-wrap-distance-right:0;mso-wrap-distance-bottom:0;mso-position-horizontal:absolute;mso-position-horizontal-relative:page;mso-position-vertical:absolute;mso-position-vertical-relative:text;v-text-anchor:top" coordsize="6148070,1270" o:gfxdata="UEsDBBQABgAIAAAAIQC2gziS/gAAAOEBAAATAAAAW0NvbnRlbnRfVHlwZXNdLnhtbJSRQU7DMBBF 90jcwfIWJU67QAgl6YK0S0CoHGBkTxKLZGx5TGhvj5O2G0SRWNoz/78nu9wcxkFMGNg6quQqL6RA 0s5Y6ir5vt9lD1JwBDIwOMJKHpHlpr69KfdHjyxSmriSfYz+USnWPY7AufNIadK6MEJMx9ApD/oD OlTrorhX2lFEilmcO2RdNtjC5xDF9pCuTyYBB5bi6bQ4syoJ3g9WQ0ymaiLzg5KdCXlKLjvcW893 SUOqXwnz5DrgnHtJTxOsQfEKIT7DmDSUCaxw7Rqn8787ZsmRM9e2VmPeBN4uqYvTtW7jvijg9N/y JsXecLq0q+WD6m8AAAD//wMAUEsDBBQABgAIAAAAIQA4/SH/1gAAAJQBAAALAAAAX3JlbHMvLnJl bHOkkMFqwzAMhu+DvYPRfXGawxijTi+j0GvpHsDYimMaW0Yy2fr2M4PBMnrbUb/Q94l/f/hMi1qR JVI2sOt6UJgd+ZiDgffL8ekFlFSbvV0oo4EbChzGx4f9GRdb25HMsYhqlCwG5lrLq9biZkxWOiqY 22YiTra2kYMu1l1tQD30/bPm3wwYN0x18gb45AdQl1tp5j/sFB2T0FQ7R0nTNEV3j6o9feQzro1i OWA14Fm+Q8a1a8+Bvu/d/dMb2JY5uiPbhG/ktn4cqGU/er3pcvwCAAD//wMAUEsDBBQABgAIAAAA IQC0MKBRFAIAAFsEAAAOAAAAZHJzL2Uyb0RvYy54bWysVEtv2zAMvg/YfxB0X+wEbVoYcYoiWYcB RVegGXZWZDk2JosapcTOvx8lP5J1t2EXgRJp6ntQXj10jWYnha4Gk/P5LOVMGQlFbQ45/757+nTP mfPCFEKDUTk/K8cf1h8/rFqbqQVUoAuFjJoYl7U255X3NksSJyvVCDcDqwwlS8BGeNriISlQtNS9 0ckiTZdJC1hYBKmco9Ntn+Tr2L8slfTfytIpz3TOCZuPK8Z1H9ZkvRLZAYWtajnAEP+AohG1oUun VlvhBTti/VerppYIDko/k9AkUJa1VJEDsZmn79i8VcKqyIXEcXaSyf2/tvLl9GZfMUB39hnkT0eK JK112ZQJGzfUdCU2oZaAsy6qeJ5UVJ1nkg6X85v79I7ElpSbLygKLUU2fiuPzn9REPuI07PzvQfF GIlqjGRnxhDJyeChjh56zshD5Iw83PceWuHDdwFcCFl7ARLOGjipHcSsf4ecoF2y2lxXEZW7ZUpU RpZU21dQEK6JxKar6fCanDYBxf3i9jaOhgNdF0+11gGFw8N+o5GdBJHaPG5vPs8Hmf4os+j8Vriq r4upoUybwafemmDSHorzK7KWpjnn7tdRoOJMfzU0LmH0xwDHYD8G6PUG4gOJAtGdu+6HQMvC9Tn3 5OwLjMMostG0oMFUG7408Hj0UNbB0ThDPaJhQxMc5RpeW3gi1/tYdfknrH8DAAD//wMAUEsDBBQA BgAIAAAAIQBrFjND3QAAAAoBAAAPAAAAZHJzL2Rvd25yZXYueG1sTI/BTsMwDIbvSLxDZCQuiKWt JtZ1TSeEmODK2AO4jddWS5zSZGv39mQnOP72p9+fy+1sjbjQ6HvHCtJFAoK4cbrnVsHhe/ecg/AB WaNxTAqu5GFb3d+VWGg38Rdd9qEVsYR9gQq6EIZCSt90ZNEv3EAcd0c3Wgwxjq3UI06x3BqZJcmL tNhzvNDhQG8dNaf92So4/dS98R8m4FRTvnv/PFyzp0Spx4f5dQMi0Bz+YLjpR3WoolPtzqy9MDGn aRZRBcvVGsQNSFbrJYg6TvIUZFXK/y9UvwAAAP//AwBQSwECLQAUAAYACAAAACEAtoM4kv4AAADh AQAAEwAAAAAAAAAAAAAAAAAAAAAAW0NvbnRlbnRfVHlwZXNdLnhtbFBLAQItABQABgAIAAAAIQA4 /SH/1gAAAJQBAAALAAAAAAAAAAAAAAAAAC8BAABfcmVscy8ucmVsc1BLAQItABQABgAIAAAAIQC0 MKBRFAIAAFsEAAAOAAAAAAAAAAAAAAAAAC4CAABkcnMvZTJvRG9jLnhtbFBLAQItABQABgAIAAAA IQBrFjND3QAAAAoBAAAPAAAAAAAAAAAAAAAAAG4EAABkcnMvZG93bnJldi54bWxQSwUGAAAAAAQA BADzAAAAeAUAAAAA " path="m,l6147600,e" filled="f" strokecolor="#cad4e1" strokeweight=".65pt">
                 <v:path arrowok="t"/>
                 <w10:wrap type="topAndBottom" anchorx="page"/>
               </v:shape>
@@ -391,7 +375,7 @@
           <w:color w:val="111826"/>
           <w:w w:val="115"/>
         </w:rPr>
-        <w:t>Mid-Level Full Stack Developer with over four years of professional experience in technology, working continuously in software development since 2022. At Minsait, an Indra Group company (Spain), contributes to large-scale enterprise systems for public healthcare, traffic, and defense. Strong experience with Java, Spring Boot, Quarkus, Angular, Vue, TypeScript, PostgreSQL, and Oracle. Contributes to the modernization of SINGRA 2 (Brazilian Navy), migrating a legacy Angular 6/DWR architecture to Angular 21, REST/JSON APIs with JWT Bearer authentication, and Spring Boot 4 with Java 25. Experience with SonarQube, automated testing, technical analysis, business rules, integrations, relational databases, and agile methods. Personal projects emphasize privacy, performance, accessibility, and measurable quality.</w:t>
+        <w:t xml:space="preserve">Mid-Level Full Stack Developer with over four years of professional experience in technology, working continuously in software development since 2022. At Minsait, an Indra Group company (Spain), contributes to large-scale enterprise systems for public healthcare, traffic, and defense. Strong experience with Java, Spring Boot, Quarkus, Angular, Vue, TypeScript, PostgreSQL, and Oracle. Contributes to the modernization of SINGRA 2 (Brazilian Navy), migrating a legacy frontend architecture to Angular 21, REST/JSON APIs with JWT Bearer authentication, and Spring Boot 4 with Java 25. Experience with SonarQube, automated testing, technical analysis, business rules, integrations, relational databases, and agile methods. Personal projects emphasize privacy, performance, accessibility, and measurable quality.</w:t>
       </w:r>
     </w:p>
     <w:p>
@@ -469,7 +453,7 @@
           </mc:Choice>
           <mc:Fallback>
             <w:pict>
-              <v:shape w14:anchorId="742D7288" id="Graphic 7" o:spid="_x0000_s1026" style="position:absolute;margin-left:55.6pt;margin-top:22.5pt;width:484.1pt;height:.1pt;z-index:-15728128;visibility:visible;mso-wrap-style:square;mso-wrap-distance-left:0;mso-wrap-distance-top:0;mso-wrap-distance-right:0;mso-wrap-distance-bottom:0;mso-position-horizontal:absolute;mso-position-horizontal-relative:page;mso-position-vertical:absolute;mso-position-vertical-relative:text;v-text-anchor:top" coordsize="6148070,1270" o:gfxdata="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" path="m,l6147600,e" filled="f" strokecolor="#cad4e1" strokeweight=".65pt">
+              <v:shape w14:anchorId="742D7288" id="Graphic 7" o:spid="_x0000_s1026" style="position:absolute;margin-left:55.6pt;margin-top:22.5pt;width:484.1pt;height:.1pt;z-index:-15728128;visibility:visible;mso-wrap-style:square;mso-wrap-distance-left:0;mso-wrap-distance-top:0;mso-wrap-distance-right:0;mso-wrap-distance-bottom:0;mso-position-horizontal:absolute;mso-position-horizontal-relative:page;mso-position-vertical:absolute;mso-position-vertical-relative:text;v-text-anchor:top" coordsize="6148070,1270" o:gfxdata="UEsDBBQABgAIAAAAIQC2gziS/gAAAOEBAAATAAAAW0NvbnRlbnRfVHlwZXNdLnhtbJSRQU7DMBBF 90jcwfIWJU67QAgl6YK0S0CoHGBkTxKLZGx5TGhvj5O2G0SRWNoz/78nu9wcxkFMGNg6quQqL6RA 0s5Y6ir5vt9lD1JwBDIwOMJKHpHlpr69KfdHjyxSmriSfYz+USnWPY7AufNIadK6MEJMx9ApD/oD OlTrorhX2lFEilmcO2RdNtjC5xDF9pCuTyYBB5bi6bQ4syoJ3g9WQ0ymaiLzg5KdCXlKLjvcW893 SUOqXwnz5DrgnHtJTxOsQfEKIT7DmDSUCaxw7Rqn8787ZsmRM9e2VmPeBN4uqYvTtW7jvijg9N/y JsXecLq0q+WD6m8AAAD//wMAUEsDBBQABgAIAAAAIQA4/SH/1gAAAJQBAAALAAAAX3JlbHMvLnJl bHOkkMFqwzAMhu+DvYPRfXGawxijTi+j0GvpHsDYimMaW0Yy2fr2M4PBMnrbUb/Q94l/f/hMi1qR JVI2sOt6UJgd+ZiDgffL8ekFlFSbvV0oo4EbChzGx4f9GRdb25HMsYhqlCwG5lrLq9biZkxWOiqY 22YiTra2kYMu1l1tQD30/bPm3wwYN0x18gb45AdQl1tp5j/sFB2T0FQ7R0nTNEV3j6o9feQzro1i OWA14Fm+Q8a1a8+Bvu/d/dMb2JY5uiPbhG/ktn4cqGU/er3pcvwCAAD//wMAUEsDBBQABgAIAAAA IQC0MKBRFAIAAFsEAAAOAAAAZHJzL2Uyb0RvYy54bWysVEtv2zAMvg/YfxB0X+wEbVoYcYoiWYcB RVegGXZWZDk2JosapcTOvx8lP5J1t2EXgRJp6ntQXj10jWYnha4Gk/P5LOVMGQlFbQ45/757+nTP mfPCFEKDUTk/K8cf1h8/rFqbqQVUoAuFjJoYl7U255X3NksSJyvVCDcDqwwlS8BGeNriISlQtNS9 0ckiTZdJC1hYBKmco9Ntn+Tr2L8slfTfytIpz3TOCZuPK8Z1H9ZkvRLZAYWtajnAEP+AohG1oUun VlvhBTti/VerppYIDko/k9AkUJa1VJEDsZmn79i8VcKqyIXEcXaSyf2/tvLl9GZfMUB39hnkT0eK JK112ZQJGzfUdCU2oZaAsy6qeJ5UVJ1nkg6X85v79I7ElpSbLygKLUU2fiuPzn9REPuI07PzvQfF GIlqjGRnxhDJyeChjh56zshD5Iw83PceWuHDdwFcCFl7ARLOGjipHcSsf4ecoF2y2lxXEZW7ZUpU RpZU21dQEK6JxKar6fCanDYBxf3i9jaOhgNdF0+11gGFw8N+o5GdBJHaPG5vPs8Hmf4os+j8Vriq r4upoUybwafemmDSHorzK7KWpjnn7tdRoOJMfzU0LmH0xwDHYD8G6PUG4gOJAtGdu+6HQMvC9Tn3 5OwLjMMostG0oMFUG7408Hj0UNbB0ThDPaJhQxMc5RpeW3gi1/tYdfknrH8DAAD//wMAUEsDBBQA BgAIAAAAIQCL0QLK3AAAAAoBAAAPAAAAZHJzL2Rvd25yZXYueG1sTI/NTsMwEITvSLyDtUhcELUT FWhDnAohKri29AE2yTaJ6p8Qu0369mxOcJzZT7Mz+WayRlxoCJ13GpKFAkGu8nXnGg2H7+3jCkSI 6Go03pGGKwXYFLc3OWa1H92OLvvYCA5xIUMNbYx9JmWoWrIYFr4nx7ejHyxGlkMj6wFHDrdGpko9 S4ud4w8t9vTeUnXan62G00/ZmfBpIo4lrbYfX4dr+qC0vr+b3l5BRJriHwxzfa4OBXcq/dnVQRjW SZIyqmH5xJtmQL2slyDK2UlBFrn8P6H4BQAA//8DAFBLAQItABQABgAIAAAAIQC2gziS/gAAAOEB AAATAAAAAAAAAAAAAAAAAAAAAABbQ29udGVudF9UeXBlc10ueG1sUEsBAi0AFAAGAAgAAAAhADj9 If/WAAAAlAEAAAsAAAAAAAAAAAAAAAAALwEAAF9yZWxzLy5yZWxzUEsBAi0AFAAGAAgAAAAhALQw oFEUAgAAWwQAAA4AAAAAAAAAAAAAAAAALgIAAGRycy9lMm9Eb2MueG1sUEsBAi0AFAAGAAgAAAAh AIvRAsrcAAAACgEAAA8AAAAAAAAAAAAAAAAAbgQAAGRycy9kb3ducmV2LnhtbFBLBQYAAAAABAAE APMAAAB3BQAAAAA= " path="m,l6147600,e" filled="f" strokecolor="#cad4e1" strokeweight=".65pt">
                 <v:path arrowok="t"/>
                 <w10:wrap type="topAndBottom" anchorx="page"/>
               </v:shape>
@@ -496,55 +480,7 @@
           <w:color w:val="111826"/>
           <w:w w:val="110"/>
         </w:rPr>
-        <w:t xml:space="preserve">Backend: Java 11/21/25, Spring Boot 2/3/4, </w:t>
-      </w:r>
-      <w:proofErr w:type="spellStart"/>
-      <w:r>
-        <w:rPr>
-          <w:color w:val="111826"/>
-          <w:w w:val="110"/>
-        </w:rPr>
-        <w:t>Quarkus</w:t>
-      </w:r>
-      <w:proofErr w:type="spellEnd"/>
-      <w:r>
-        <w:rPr>
-          <w:color w:val="111826"/>
-          <w:w w:val="110"/>
-        </w:rPr>
-        <w:t xml:space="preserve">, REST APIs, JPA/Hibernate, Maven, </w:t>
-      </w:r>
-      <w:proofErr w:type="spellStart"/>
-      <w:r>
-        <w:rPr>
-          <w:color w:val="111826"/>
-          <w:w w:val="110"/>
-        </w:rPr>
-        <w:t>MapStruct</w:t>
-      </w:r>
-      <w:proofErr w:type="spellEnd"/>
-      <w:r>
-        <w:rPr>
-          <w:color w:val="111826"/>
-          <w:w w:val="110"/>
-        </w:rPr>
-        <w:t xml:space="preserve">, Node.js, </w:t>
-      </w:r>
-      <w:proofErr w:type="spellStart"/>
-      <w:r>
-        <w:rPr>
-          <w:color w:val="111826"/>
-          <w:w w:val="110"/>
-        </w:rPr>
-        <w:t>NestJS</w:t>
-      </w:r>
-      <w:proofErr w:type="spellEnd"/>
-      <w:r>
-        <w:rPr>
-          <w:color w:val="111826"/>
-          <w:w w:val="110"/>
-        </w:rPr>
-        <w:t xml:space="preserve"> Frontend: AngularJS, Angular 6/21, React 19, Next.js 16, Vue 2, TypeScript, JavaScript, HTML, CSS, Tailwind CSS</w:t>
+        <w:t xml:space="preserve">Backend: Java 11/21/25, Spring Boot 2/3/4, Quarkus, REST APIs, JPA/Hibernate, Maven, MapStruct, Node.js, NestJS Frontend: AngularJS, Angular 17/21, React 19, Next.js 16, Vue 2, TypeScript, JavaScript, HTML, CSS, Tailwind CSS</w:t>
       </w:r>
     </w:p>
     <w:p>
@@ -651,7 +587,7 @@
           </mc:Choice>
           <mc:Fallback>
             <w:pict>
-              <v:shape w14:anchorId="00A46100" id="Graphic 8" o:spid="_x0000_s1026" style="position:absolute;margin-left:55.6pt;margin-top:22.45pt;width:484.1pt;height:.1pt;z-index:-15727616;visibility:visible;mso-wrap-style:square;mso-wrap-distance-left:0;mso-wrap-distance-top:0;mso-wrap-distance-right:0;mso-wrap-distance-bottom:0;mso-position-horizontal:absolute;mso-position-horizontal-relative:page;mso-position-vertical:absolute;mso-position-vertical-relative:text;v-text-anchor:top" coordsize="6148070,1270" o:gfxdata="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" path="m,l6147600,e" filled="f" strokecolor="#cad4e1" strokeweight=".65pt">
+              <v:shape w14:anchorId="00A46100" id="Graphic 8" o:spid="_x0000_s1026" style="position:absolute;margin-left:55.6pt;margin-top:22.45pt;width:484.1pt;height:.1pt;z-index:-15727616;visibility:visible;mso-wrap-style:square;mso-wrap-distance-left:0;mso-wrap-distance-top:0;mso-wrap-distance-right:0;mso-wrap-distance-bottom:0;mso-position-horizontal:absolute;mso-position-horizontal-relative:page;mso-position-vertical:absolute;mso-position-vertical-relative:text;v-text-anchor:top" coordsize="6148070,1270" o:gfxdata="UEsDBBQABgAIAAAAIQC2gziS/gAAAOEBAAATAAAAW0NvbnRlbnRfVHlwZXNdLnhtbJSRQU7DMBBF 90jcwfIWJU67QAgl6YK0S0CoHGBkTxKLZGx5TGhvj5O2G0SRWNoz/78nu9wcxkFMGNg6quQqL6RA 0s5Y6ir5vt9lD1JwBDIwOMJKHpHlpr69KfdHjyxSmriSfYz+USnWPY7AufNIadK6MEJMx9ApD/oD OlTrorhX2lFEilmcO2RdNtjC5xDF9pCuTyYBB5bi6bQ4syoJ3g9WQ0ymaiLzg5KdCXlKLjvcW893 SUOqXwnz5DrgnHtJTxOsQfEKIT7DmDSUCaxw7Rqn8787ZsmRM9e2VmPeBN4uqYvTtW7jvijg9N/y JsXecLq0q+WD6m8AAAD//wMAUEsDBBQABgAIAAAAIQA4/SH/1gAAAJQBAAALAAAAX3JlbHMvLnJl bHOkkMFqwzAMhu+DvYPRfXGawxijTi+j0GvpHsDYimMaW0Yy2fr2M4PBMnrbUb/Q94l/f/hMi1qR JVI2sOt6UJgd+ZiDgffL8ekFlFSbvV0oo4EbChzGx4f9GRdb25HMsYhqlCwG5lrLq9biZkxWOiqY 22YiTra2kYMu1l1tQD30/bPm3wwYN0x18gb45AdQl1tp5j/sFB2T0FQ7R0nTNEV3j6o9feQzro1i OWA14Fm+Q8a1a8+Bvu/d/dMb2JY5uiPbhG/ktn4cqGU/er3pcvwCAAD//wMAUEsDBBQABgAIAAAA IQC0MKBRFAIAAFsEAAAOAAAAZHJzL2Uyb0RvYy54bWysVEtv2zAMvg/YfxB0X+wEbVoYcYoiWYcB RVegGXZWZDk2JosapcTOvx8lP5J1t2EXgRJp6ntQXj10jWYnha4Gk/P5LOVMGQlFbQ45/757+nTP mfPCFEKDUTk/K8cf1h8/rFqbqQVUoAuFjJoYl7U255X3NksSJyvVCDcDqwwlS8BGeNriISlQtNS9 0ckiTZdJC1hYBKmco9Ntn+Tr2L8slfTfytIpz3TOCZuPK8Z1H9ZkvRLZAYWtajnAEP+AohG1oUun VlvhBTti/VerppYIDko/k9AkUJa1VJEDsZmn79i8VcKqyIXEcXaSyf2/tvLl9GZfMUB39hnkT0eK JK112ZQJGzfUdCU2oZaAsy6qeJ5UVJ1nkg6X85v79I7ElpSbLygKLUU2fiuPzn9REPuI07PzvQfF GIlqjGRnxhDJyeChjh56zshD5Iw83PceWuHDdwFcCFl7ARLOGjipHcSsf4ecoF2y2lxXEZW7ZUpU RpZU21dQEK6JxKar6fCanDYBxf3i9jaOhgNdF0+11gGFw8N+o5GdBJHaPG5vPs8Hmf4os+j8Vriq r4upoUybwafemmDSHorzK7KWpjnn7tdRoOJMfzU0LmH0xwDHYD8G6PUG4gOJAtGdu+6HQMvC9Tn3 5OwLjMMostG0oMFUG7408Hj0UNbB0ThDPaJhQxMc5RpeW3gi1/tYdfknrH8DAAD//wMAUEsDBBQA BgAIAAAAIQChEIq43QAAAAoBAAAPAAAAZHJzL2Rvd25yZXYueG1sTI/LTsNADEX3SPzDyEhsUDtJ FKANmVQIUcGW0g9wMm4SdR4hM23Sv8ddwfLaR9fH5Wa2RpxpDL13CtJlAoJc43XvWgX77+1iBSJE dBqNd6TgQgE21e1NiYX2k/ui8y62gktcKFBBF+NQSBmajiyGpR/I8e7gR4uR49hKPeLE5dbILEme pMXe8YUOB3rrqDnuTlbB8afuTfgwEaeaVtv3z/0le0iUur+bX19ARJrjHwxXfVaHip1qf3I6CMM5 TTNGFeT5GsQVSJ7XOYiaJ48pyKqU/1+ofgEAAP//AwBQSwECLQAUAAYACAAAACEAtoM4kv4AAADh AQAAEwAAAAAAAAAAAAAAAAAAAAAAW0NvbnRlbnRfVHlwZXNdLnhtbFBLAQItABQABgAIAAAAIQA4 /SH/1gAAAJQBAAALAAAAAAAAAAAAAAAAAC8BAABfcmVscy8ucmVsc1BLAQItABQABgAIAAAAIQC0 MKBRFAIAAFsEAAAOAAAAAAAAAAAAAAAAAC4CAABkcnMvZTJvRG9jLnhtbFBLAQItABQABgAIAAAA IQChEIq43QAAAAoBAAAPAAAAAAAAAAAAAAAAAG4EAABkcnMvZG93bnJldi54bWxQSwUGAAAAAAQA BADzAAAAeAUAAAAA " path="m,l6147600,e" filled="f" strokecolor="#cad4e1" strokeweight=".65pt">
                 <v:path arrowok="t"/>
                 <w10:wrap type="topAndBottom" anchorx="page"/>
               </v:shape>
@@ -849,7 +785,7 @@
           <w:w w:val="110"/>
           <w:sz w:val="16"/>
         </w:rPr>
-        <w:t>Responsible for running and monitoring SonarQube in the Brazilian Navy project, supporting the identification of vulnerabilities, code smells, duplication, and technical debt.</w:t>
+        <w:t xml:space="preserve">Static code analysis with SonarQube on the Brazilian Navy project, supporting continuous improvement of code quality and maintainability.</w:t>
       </w:r>
     </w:p>
     <w:p>
@@ -911,7 +847,7 @@
           <w:w w:val="110"/>
           <w:sz w:val="16"/>
         </w:rPr>
-        <w:t>SINGRA 2 / SINGRA21 Modernization | 13/04/2026 - Present | MAR-DAbM / Brazilian Navy: Migration of the Angular 6/DWR frontend to Angular 21 and REST/JSON APIs with JWT Bearer authentication; backend upgrade to Java 25 and Spring Boot 4 while preserving service, business, and persistence layers. Node.js 20.19.0 and Oracle.</w:t>
+        <w:t xml:space="preserve">SINGRA 2 Modernization | Apr 2026 - Present | Brazilian Navy: Migration of a legacy frontend architecture to Angular 21 and REST/JSON APIs with JWT Bearer authentication; backend upgrade to Java 25 and Spring Boot 4 while preserving service, business, and persistence layers. Oracle.</w:t>
       </w:r>
     </w:p>
     <w:p>
@@ -938,7 +874,7 @@
           <w:w w:val="105"/>
           <w:sz w:val="16"/>
         </w:rPr>
-        <w:t>Legacy SINGRA 2 | 10/09/2025 - 10/04/2026 | MAR-DAbM / Brazilian Navy: Enhancement and support of enterprise modules with Java 21, Spring Boot 2.x, Angular 6.1.0, Node.js 10.16.0, and Oracle, plus DWR, Redis, Caffeine, and Guava.</w:t>
+        <w:t xml:space="preserve">SINGRA 2 (previous architecture) | Sep 2025 - Apr 2026 | Brazilian Navy: Enhancement and support of enterprise modules on a legacy Java, Spring Boot, and Angular stack with Oracle, including caching and session-handling layers.</w:t>
       </w:r>
     </w:p>
     <w:p>
@@ -964,7 +900,7 @@
           <w:w w:val="110"/>
           <w:sz w:val="16"/>
         </w:rPr>
-        <w:t>SIDOAR | 12/04/2025 - 10/09/2025 | Goiás State Department of Health: Integrated Organ Donation and Recipient Evaluation System. Java 11, Spring Boot, AngularJS, and PostgreSQL.</w:t>
+        <w:t xml:space="preserve">SIDOAR | Apr 2025 - Sep 2025 | Goiás State Department of Health: Integrated Organ Donation and Recipient Evaluation System. Java 11, Spring Boot, AngularJS, and PostgreSQL.</w:t>
       </w:r>
     </w:p>
     <w:p>
@@ -990,7 +926,7 @@
           <w:w w:val="110"/>
           <w:sz w:val="16"/>
         </w:rPr>
-        <w:t>SRIE | 10/12/2025 - 04/02/2026 | Goiás State Department of Health: Immunobiological Products System for People with Special Conditions. Java 21, Spring Boot, AngularJS, and PostgreSQL.</w:t>
+        <w:t xml:space="preserve">SRIE | Dec 2025 - Feb 2026 | Goiás State Department of Health: Immunobiological Products System for People with Special Conditions. Java 21, Spring Boot, AngularJS, and PostgreSQL.</w:t>
       </w:r>
     </w:p>
     <w:p>
@@ -1016,25 +952,7 @@
           <w:w w:val="105"/>
           <w:sz w:val="16"/>
         </w:rPr>
-        <w:t xml:space="preserve">BATEU - Citizen/Police Officer | 02/05/2025 - 03/06/2025 | CELEPAR: State Traffic Accident Registry (Paraná Military Police). Java 21, </w:t>
-      </w:r>
-      <w:proofErr w:type="spellStart"/>
-      <w:r>
-        <w:rPr>
-          <w:color w:val="111826"/>
-          <w:w w:val="105"/>
-          <w:sz w:val="16"/>
-        </w:rPr>
-        <w:t>Quarkus</w:t>
-      </w:r>
-      <w:proofErr w:type="spellEnd"/>
-      <w:r>
-        <w:rPr>
-          <w:color w:val="111826"/>
-          <w:w w:val="105"/>
-          <w:sz w:val="16"/>
-        </w:rPr>
-        <w:t>, Vue, and PostgreSQL.</w:t>
+        <w:t xml:space="preserve">BATEU - Citizen/Police Officer | May 2025 - Jun 2025 | CELEPAR: State Traffic Accident Registry (Paraná Military Police). Java 21, Quarkus, Vue, and PostgreSQL.</w:t>
       </w:r>
     </w:p>
     <w:p>
@@ -1060,7 +978,7 @@
           <w:w w:val="105"/>
           <w:sz w:val="16"/>
         </w:rPr>
-        <w:t>SISESG | 25/03/2025 - 12/04/2025 | Goiás State Department of Health: Health School System. Java 11, Spring Boot, AngularJS, and PostgreSQL.</w:t>
+        <w:t xml:space="preserve">SISESG | Mar 2025 - Apr 2025 | Goiás State Department of Health: Health School System. Java 11, Spring Boot, AngularJS, and PostgreSQL.</w:t>
       </w:r>
     </w:p>
     <w:p>
@@ -1343,7 +1261,6 @@
         </w:rPr>
         <w:t xml:space="preserve">FUNDAÇÃO JAIME CÂMARA | </w:t>
       </w:r>
-      <w:proofErr w:type="spellStart"/>
       <w:r>
         <w:rPr>
           <w:b/>
@@ -1352,69 +1269,16 @@
           <w:sz w:val="18"/>
           <w:lang w:val="pt-BR"/>
         </w:rPr>
-        <w:t>Technical</w:t>
-      </w:r>
-      <w:proofErr w:type="spellEnd"/>
+        <w:t xml:space="preserve">Technical Support </w:t>
+      </w:r>
       <w:r>
         <w:rPr>
           <w:b/>
-          <w:color w:val="0890B1"/>
-          <w:w w:val="115"/>
+          <w:color w:val="111826"/>
           <w:sz w:val="18"/>
           <w:lang w:val="pt-BR"/>
         </w:rPr>
-        <w:t xml:space="preserve"> </w:t>
-      </w:r>
-      <w:proofErr w:type="spellStart"/>
-      <w:r>
-        <w:rPr>
-          <w:b/>
-          <w:color w:val="0890B1"/>
-          <w:w w:val="115"/>
-          <w:sz w:val="18"/>
-          <w:lang w:val="pt-BR"/>
-        </w:rPr>
-        <w:t>Support</w:t>
-      </w:r>
-      <w:proofErr w:type="spellEnd"/>
-      <w:r>
-        <w:rPr>
-          <w:b/>
-          <w:color w:val="0890B1"/>
-          <w:w w:val="115"/>
-          <w:sz w:val="18"/>
-          <w:lang w:val="pt-BR"/>
-        </w:rPr>
-        <w:t xml:space="preserve"> </w:t>
-      </w:r>
-      <w:r>
-        <w:rPr>
-          <w:b/>
-          <w:color w:val="111826"/>
-          <w:sz w:val="18"/>
-          <w:lang w:val="pt-BR"/>
-        </w:rPr>
-        <w:t xml:space="preserve">| </w:t>
-      </w:r>
-      <w:proofErr w:type="spellStart"/>
-      <w:r>
-        <w:rPr>
-          <w:b/>
-          <w:color w:val="111826"/>
-          <w:sz w:val="18"/>
-          <w:lang w:val="pt-BR"/>
-        </w:rPr>
-        <w:t>Apr</w:t>
-      </w:r>
-      <w:proofErr w:type="spellEnd"/>
-      <w:r>
-        <w:rPr>
-          <w:b/>
-          <w:color w:val="111826"/>
-          <w:sz w:val="18"/>
-          <w:lang w:val="pt-BR"/>
-        </w:rPr>
-        <w:t xml:space="preserve"> 2022 - Jul 2022</w:t>
+        <w:t xml:space="preserve">| Apr 2022 - Jul 2022</w:t>
       </w:r>
     </w:p>
     <w:p>
@@ -1562,7 +1426,7 @@
           </mc:Choice>
           <mc:Fallback>
             <w:pict>
-              <v:shape w14:anchorId="74664F74" id="Graphic 9" o:spid="_x0000_s1026" style="position:absolute;margin-left:55.6pt;margin-top:23.1pt;width:484.1pt;height:.1pt;z-index:-15727104;visibility:visible;mso-wrap-style:square;mso-wrap-distance-left:0;mso-wrap-distance-top:0;mso-wrap-distance-right:0;mso-wrap-distance-bottom:0;mso-position-horizontal:absolute;mso-position-horizontal-relative:page;mso-position-vertical:absolute;mso-position-vertical-relative:text;v-text-anchor:top" coordsize="6148070,1270" o:gfxdata="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" path="m,l6147600,e" filled="f" strokecolor="#cad4e1" strokeweight=".65pt">
+              <v:shape w14:anchorId="74664F74" id="Graphic 9" o:spid="_x0000_s1026" style="position:absolute;margin-left:55.6pt;margin-top:23.1pt;width:484.1pt;height:.1pt;z-index:-15727104;visibility:visible;mso-wrap-style:square;mso-wrap-distance-left:0;mso-wrap-distance-top:0;mso-wrap-distance-right:0;mso-wrap-distance-bottom:0;mso-position-horizontal:absolute;mso-position-horizontal-relative:page;mso-position-vertical:absolute;mso-position-vertical-relative:text;v-text-anchor:top" coordsize="6148070,1270" o:gfxdata="UEsDBBQABgAIAAAAIQC2gziS/gAAAOEBAAATAAAAW0NvbnRlbnRfVHlwZXNdLnhtbJSRQU7DMBBF 90jcwfIWJU67QAgl6YK0S0CoHGBkTxKLZGx5TGhvj5O2G0SRWNoz/78nu9wcxkFMGNg6quQqL6RA 0s5Y6ir5vt9lD1JwBDIwOMJKHpHlpr69KfdHjyxSmriSfYz+USnWPY7AufNIadK6MEJMx9ApD/oD OlTrorhX2lFEilmcO2RdNtjC5xDF9pCuTyYBB5bi6bQ4syoJ3g9WQ0ymaiLzg5KdCXlKLjvcW893 SUOqXwnz5DrgnHtJTxOsQfEKIT7DmDSUCaxw7Rqn8787ZsmRM9e2VmPeBN4uqYvTtW7jvijg9N/y JsXecLq0q+WD6m8AAAD//wMAUEsDBBQABgAIAAAAIQA4/SH/1gAAAJQBAAALAAAAX3JlbHMvLnJl bHOkkMFqwzAMhu+DvYPRfXGawxijTi+j0GvpHsDYimMaW0Yy2fr2M4PBMnrbUb/Q94l/f/hMi1qR JVI2sOt6UJgd+ZiDgffL8ekFlFSbvV0oo4EbChzGx4f9GRdb25HMsYhqlCwG5lrLq9biZkxWOiqY 22YiTra2kYMu1l1tQD30/bPm3wwYN0x18gb45AdQl1tp5j/sFB2T0FQ7R0nTNEV3j6o9feQzro1i OWA14Fm+Q8a1a8+Bvu/d/dMb2JY5uiPbhG/ktn4cqGU/er3pcvwCAAD//wMAUEsDBBQABgAIAAAA IQC0MKBRFAIAAFsEAAAOAAAAZHJzL2Uyb0RvYy54bWysVEtv2zAMvg/YfxB0X+wEbVoYcYoiWYcB RVegGXZWZDk2JosapcTOvx8lP5J1t2EXgRJp6ntQXj10jWYnha4Gk/P5LOVMGQlFbQ45/757+nTP mfPCFEKDUTk/K8cf1h8/rFqbqQVUoAuFjJoYl7U255X3NksSJyvVCDcDqwwlS8BGeNriISlQtNS9 0ckiTZdJC1hYBKmco9Ntn+Tr2L8slfTfytIpz3TOCZuPK8Z1H9ZkvRLZAYWtajnAEP+AohG1oUun VlvhBTti/VerppYIDko/k9AkUJa1VJEDsZmn79i8VcKqyIXEcXaSyf2/tvLl9GZfMUB39hnkT0eK JK112ZQJGzfUdCU2oZaAsy6qeJ5UVJ1nkg6X85v79I7ElpSbLygKLUU2fiuPzn9REPuI07PzvQfF GIlqjGRnxhDJyeChjh56zshD5Iw83PceWuHDdwFcCFl7ARLOGjipHcSsf4ecoF2y2lxXEZW7ZUpU RpZU21dQEK6JxKar6fCanDYBxf3i9jaOhgNdF0+11gGFw8N+o5GdBJHaPG5vPs8Hmf4os+j8Vriq r4upoUybwafemmDSHorzK7KWpjnn7tdRoOJMfzU0LmH0xwDHYD8G6PUG4gOJAtGdu+6HQMvC9Tn3 5OwLjMMostG0oMFUG7408Hj0UNbB0ThDPaJhQxMc5RpeW3gi1/tYdfknrH8DAAD//wMAUEsDBBQA BgAIAAAAIQBKvw5v3AAAAAoBAAAPAAAAZHJzL2Rvd25yZXYueG1sTI/BTsMwEETvSPyDtUhcEHUS RaWEOBVCVHCl7Qc48ZJEtdchdpv079mc4LSa3dHsm3I7OysuOIbek4J0lYBAarzpqVVwPOweNyBC 1GS09YQKrhhgW93elLowfqIvvOxjKziEQqEVdDEOhZSh6dDpsPIDEt++/eh0ZDm20ox64nBnZZYk a+l0T/yh0wO+ddic9men4PRT9zZ82KinGje798/jNXtIlLq/m19fQESc458ZFnxGh4qZan8mE4Rl naYZWxXka56LIXl6zkHUyyYHWZXyf4XqFwAA//8DAFBLAQItABQABgAIAAAAIQC2gziS/gAAAOEB AAATAAAAAAAAAAAAAAAAAAAAAABbQ29udGVudF9UeXBlc10ueG1sUEsBAi0AFAAGAAgAAAAhADj9 If/WAAAAlAEAAAsAAAAAAAAAAAAAAAAALwEAAF9yZWxzLy5yZWxzUEsBAi0AFAAGAAgAAAAhALQw oFEUAgAAWwQAAA4AAAAAAAAAAAAAAAAALgIAAGRycy9lMm9Eb2MueG1sUEsBAi0AFAAGAAgAAAAh AEq/Dm/cAAAACgEAAA8AAAAAAAAAAAAAAAAAbgQAAGRycy9kb3ducmV2LnhtbFBLBQYAAAAABAAE APMAAAB3BQAAAAA= " path="m,l6147600,e" filled="f" strokecolor="#cad4e1" strokeweight=".65pt">
                 <v:path arrowok="t"/>
                 <w10:wrap type="topAndBottom" anchorx="page"/>
               </v:shape>
@@ -1710,7 +1574,6 @@
         <w:spacing w:before="108"/>
       </w:pPr>
       <w:hyperlink r:id="rId14">
-        <w:proofErr w:type="spellStart"/>
         <w:r>
           <w:rPr>
             <w:color w:val="111826"/>
@@ -1718,7 +1581,6 @@
           </w:rPr>
           <w:t>Compressify</w:t>
         </w:r>
-        <w:proofErr w:type="spellEnd"/>
         <w:r>
           <w:rPr>
             <w:color w:val="111826"/>
@@ -1742,7 +1604,6 @@
           </w:rPr>
           <w:t xml:space="preserve"> </w:t>
         </w:r>
-        <w:proofErr w:type="spellStart"/>
         <w:r>
           <w:rPr>
             <w:color w:val="111826"/>
@@ -1758,7 +1619,6 @@
           </w:rPr>
           <w:t>free.vercel.app</w:t>
         </w:r>
-        <w:proofErr w:type="spellEnd"/>
       </w:hyperlink>
     </w:p>
     <w:p>
@@ -1839,61 +1699,7 @@
           <w:w w:val="115"/>
           <w:sz w:val="15"/>
         </w:rPr>
-        <w:t xml:space="preserve">Technologies: Next.js 16, React 19, TypeScript 6, Tailwind CSS 4, </w:t>
-      </w:r>
-      <w:proofErr w:type="spellStart"/>
-      <w:r>
-        <w:rPr>
-          <w:color w:val="111826"/>
-          <w:w w:val="115"/>
-          <w:sz w:val="15"/>
-        </w:rPr>
-        <w:t>Zustand</w:t>
-      </w:r>
-      <w:proofErr w:type="spellEnd"/>
-      <w:r>
-        <w:rPr>
-          <w:color w:val="111826"/>
-          <w:w w:val="115"/>
-          <w:sz w:val="15"/>
-        </w:rPr>
-        <w:t xml:space="preserve">, </w:t>
-      </w:r>
-      <w:proofErr w:type="spellStart"/>
-      <w:r>
-        <w:rPr>
-          <w:color w:val="111826"/>
-          <w:w w:val="115"/>
-          <w:sz w:val="15"/>
-        </w:rPr>
-        <w:t>WebAssembly</w:t>
-      </w:r>
-      <w:proofErr w:type="spellEnd"/>
-      <w:r>
-        <w:rPr>
-          <w:color w:val="111826"/>
-          <w:w w:val="115"/>
-          <w:sz w:val="15"/>
-        </w:rPr>
-        <w:t xml:space="preserve">, </w:t>
-      </w:r>
-      <w:proofErr w:type="spellStart"/>
-      <w:r>
-        <w:rPr>
-          <w:color w:val="111826"/>
-          <w:w w:val="115"/>
-          <w:sz w:val="15"/>
-        </w:rPr>
-        <w:t>Vitest</w:t>
-      </w:r>
-      <w:proofErr w:type="spellEnd"/>
-      <w:r>
-        <w:rPr>
-          <w:color w:val="111826"/>
-          <w:w w:val="115"/>
-          <w:sz w:val="15"/>
-        </w:rPr>
-        <w:t>, and Playwright</w:t>
+        <w:t xml:space="preserve">Technologies: Next.js 16, React 19, TypeScript 6, Tailwind CSS 4, Zustand, WebAssembly, Vitest, and Playwright</w:t>
       </w:r>
     </w:p>
     <w:p>
@@ -1962,23 +1768,13 @@
           </w:rPr>
           <w:t xml:space="preserve"> </w:t>
         </w:r>
-        <w:proofErr w:type="spellStart"/>
         <w:r>
           <w:rPr>
             <w:color w:val="111826"/>
             <w:w w:val="115"/>
           </w:rPr>
-          <w:t>qr</w:t>
+          <w:t>qr-code-studio-</w:t>
         </w:r>
-        <w:proofErr w:type="spellEnd"/>
-        <w:r>
-          <w:rPr>
-            <w:color w:val="111826"/>
-            <w:w w:val="115"/>
-          </w:rPr>
-          <w:t>-code-studio-</w:t>
-        </w:r>
-        <w:proofErr w:type="spellStart"/>
         <w:r>
           <w:rPr>
             <w:color w:val="111826"/>
@@ -1987,7 +1783,6 @@
           </w:rPr>
           <w:t>free.vercel.app</w:t>
         </w:r>
-        <w:proofErr w:type="spellEnd"/>
       </w:hyperlink>
     </w:p>
     <w:p>
@@ -2068,43 +1863,7 @@
           <w:w w:val="115"/>
           <w:sz w:val="15"/>
         </w:rPr>
-        <w:t xml:space="preserve">Technologies: Next.js 16, React 19, TypeScript strict, Tailwind CSS 4, pdf-lib, </w:t>
-      </w:r>
-      <w:proofErr w:type="spellStart"/>
-      <w:r>
-        <w:rPr>
-          <w:color w:val="111826"/>
-          <w:w w:val="115"/>
-          <w:sz w:val="15"/>
-        </w:rPr>
-        <w:t>jsQR</w:t>
-      </w:r>
-      <w:proofErr w:type="spellEnd"/>
-      <w:r>
-        <w:rPr>
-          <w:color w:val="111826"/>
-          <w:w w:val="115"/>
-          <w:sz w:val="15"/>
-        </w:rPr>
-        <w:t xml:space="preserve">, </w:t>
-      </w:r>
-      <w:proofErr w:type="spellStart"/>
-      <w:r>
-        <w:rPr>
-          <w:color w:val="111826"/>
-          <w:w w:val="115"/>
-          <w:sz w:val="15"/>
-        </w:rPr>
-        <w:t>Vitest</w:t>
-      </w:r>
-      <w:proofErr w:type="spellEnd"/>
-      <w:r>
-        <w:rPr>
-          <w:color w:val="111826"/>
-          <w:w w:val="115"/>
-          <w:sz w:val="15"/>
-        </w:rPr>
-        <w:t>, and Playwright</w:t>
+        <w:t xml:space="preserve">Technologies: Next.js 16, React 19, TypeScript strict, Tailwind CSS 4, pdf-lib, jsQR, Vitest, and Playwright</w:t>
       </w:r>
     </w:p>
     <w:p>
@@ -2113,7 +1872,6 @@
         <w:spacing w:before="108"/>
       </w:pPr>
       <w:hyperlink r:id="rId16">
-        <w:proofErr w:type="spellStart"/>
         <w:r>
           <w:rPr>
             <w:color w:val="111826"/>
@@ -2121,7 +1879,6 @@
           </w:rPr>
           <w:t>FitJourneyAI</w:t>
         </w:r>
-        <w:proofErr w:type="spellEnd"/>
         <w:r>
           <w:rPr>
             <w:color w:val="111826"/>
@@ -2151,36 +1908,8 @@
             <w:spacing w:val="-2"/>
             <w:w w:val="115"/>
           </w:rPr>
-          <w:t>github.com/</w:t>
+          <w:t>github.com/Igorpcferreira/fitjourneyai</w:t>
         </w:r>
-        <w:proofErr w:type="spellStart"/>
-        <w:r>
-          <w:rPr>
-            <w:color w:val="111826"/>
-            <w:spacing w:val="-2"/>
-            <w:w w:val="115"/>
-          </w:rPr>
-          <w:t>Igorpcferreira</w:t>
-        </w:r>
-        <w:proofErr w:type="spellEnd"/>
-        <w:r>
-          <w:rPr>
-            <w:color w:val="111826"/>
-            <w:spacing w:val="-2"/>
-            <w:w w:val="115"/>
-          </w:rPr>
-          <w:t>/</w:t>
-        </w:r>
-        <w:proofErr w:type="spellStart"/>
-        <w:r>
-          <w:rPr>
-            <w:color w:val="111826"/>
-            <w:spacing w:val="-2"/>
-            <w:w w:val="115"/>
-          </w:rPr>
-          <w:t>fitjourneyai</w:t>
-        </w:r>
-        <w:proofErr w:type="spellEnd"/>
       </w:hyperlink>
     </w:p>
     <w:p>
@@ -2340,7 +2069,7 @@
           </mc:Choice>
           <mc:Fallback>
             <w:pict>
-              <v:shape w14:anchorId="0F3AFB29" id="Graphic 10" o:spid="_x0000_s1026" style="position:absolute;margin-left:55.6pt;margin-top:23.1pt;width:484.1pt;height:.1pt;z-index:-15726592;visibility:visible;mso-wrap-style:square;mso-wrap-distance-left:0;mso-wrap-distance-top:0;mso-wrap-distance-right:0;mso-wrap-distance-bottom:0;mso-position-horizontal:absolute;mso-position-horizontal-relative:page;mso-position-vertical:absolute;mso-position-vertical-relative:text;v-text-anchor:top" coordsize="6148070,1270" o:gfxdata="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" path="m,l6147600,e" filled="f" strokecolor="#cad4e1" strokeweight=".65pt">
+              <v:shape w14:anchorId="0F3AFB29" id="Graphic 10" o:spid="_x0000_s1026" style="position:absolute;margin-left:55.6pt;margin-top:23.1pt;width:484.1pt;height:.1pt;z-index:-15726592;visibility:visible;mso-wrap-style:square;mso-wrap-distance-left:0;mso-wrap-distance-top:0;mso-wrap-distance-right:0;mso-wrap-distance-bottom:0;mso-position-horizontal:absolute;mso-position-horizontal-relative:page;mso-position-vertical:absolute;mso-position-vertical-relative:text;v-text-anchor:top" coordsize="6148070,1270" o:gfxdata="UEsDBBQABgAIAAAAIQC2gziS/gAAAOEBAAATAAAAW0NvbnRlbnRfVHlwZXNdLnhtbJSRQU7DMBBF 90jcwfIWJU67QAgl6YK0S0CoHGBkTxKLZGx5TGhvj5O2G0SRWNoz/78nu9wcxkFMGNg6quQqL6RA 0s5Y6ir5vt9lD1JwBDIwOMJKHpHlpr69KfdHjyxSmriSfYz+USnWPY7AufNIadK6MEJMx9ApD/oD OlTrorhX2lFEilmcO2RdNtjC5xDF9pCuTyYBB5bi6bQ4syoJ3g9WQ0ymaiLzg5KdCXlKLjvcW893 SUOqXwnz5DrgnHtJTxOsQfEKIT7DmDSUCaxw7Rqn8787ZsmRM9e2VmPeBN4uqYvTtW7jvijg9N/y JsXecLq0q+WD6m8AAAD//wMAUEsDBBQABgAIAAAAIQA4/SH/1gAAAJQBAAALAAAAX3JlbHMvLnJl bHOkkMFqwzAMhu+DvYPRfXGawxijTi+j0GvpHsDYimMaW0Yy2fr2M4PBMnrbUb/Q94l/f/hMi1qR JVI2sOt6UJgd+ZiDgffL8ekFlFSbvV0oo4EbChzGx4f9GRdb25HMsYhqlCwG5lrLq9biZkxWOiqY 22YiTra2kYMu1l1tQD30/bPm3wwYN0x18gb45AdQl1tp5j/sFB2T0FQ7R0nTNEV3j6o9feQzro1i OWA14Fm+Q8a1a8+Bvu/d/dMb2JY5uiPbhG/ktn4cqGU/er3pcvwCAAD//wMAUEsDBBQABgAIAAAA IQC0MKBRFAIAAFsEAAAOAAAAZHJzL2Uyb0RvYy54bWysVEtv2zAMvg/YfxB0X+wEbVoYcYoiWYcB RVegGXZWZDk2JosapcTOvx8lP5J1t2EXgRJp6ntQXj10jWYnha4Gk/P5LOVMGQlFbQ45/757+nTP mfPCFEKDUTk/K8cf1h8/rFqbqQVUoAuFjJoYl7U255X3NksSJyvVCDcDqwwlS8BGeNriISlQtNS9 0ckiTZdJC1hYBKmco9Ntn+Tr2L8slfTfytIpz3TOCZuPK8Z1H9ZkvRLZAYWtajnAEP+AohG1oUun VlvhBTti/VerppYIDko/k9AkUJa1VJEDsZmn79i8VcKqyIXEcXaSyf2/tvLl9GZfMUB39hnkT0eK JK112ZQJGzfUdCU2oZaAsy6qeJ5UVJ1nkg6X85v79I7ElpSbLygKLUU2fiuPzn9REPuI07PzvQfF GIlqjGRnxhDJyeChjh56zshD5Iw83PceWuHDdwFcCFl7ARLOGjipHcSsf4ecoF2y2lxXEZW7ZUpU RpZU21dQEK6JxKar6fCanDYBxf3i9jaOhgNdF0+11gGFw8N+o5GdBJHaPG5vPs8Hmf4os+j8Vriq r4upoUybwafemmDSHorzK7KWpjnn7tdRoOJMfzU0LmH0xwDHYD8G6PUG4gOJAtGdu+6HQMvC9Tn3 5OwLjMMostG0oMFUG7408Hj0UNbB0ThDPaJhQxMc5RpeW3gi1/tYdfknrH8DAAD//wMAUEsDBBQA BgAIAAAAIQBKvw5v3AAAAAoBAAAPAAAAZHJzL2Rvd25yZXYueG1sTI/BTsMwEETvSPyDtUhcEHUS RaWEOBVCVHCl7Qc48ZJEtdchdpv079mc4LSa3dHsm3I7OysuOIbek4J0lYBAarzpqVVwPOweNyBC 1GS09YQKrhhgW93elLowfqIvvOxjKziEQqEVdDEOhZSh6dDpsPIDEt++/eh0ZDm20ox64nBnZZYk a+l0T/yh0wO+ddic9men4PRT9zZ82KinGje798/jNXtIlLq/m19fQESc458ZFnxGh4qZan8mE4Rl naYZWxXka56LIXl6zkHUyyYHWZXyf4XqFwAA//8DAFBLAQItABQABgAIAAAAIQC2gziS/gAAAOEB AAATAAAAAAAAAAAAAAAAAAAAAABbQ29udGVudF9UeXBlc10ueG1sUEsBAi0AFAAGAAgAAAAhADj9 If/WAAAAlAEAAAsAAAAAAAAAAAAAAAAALwEAAF9yZWxzLy5yZWxzUEsBAi0AFAAGAAgAAAAhALQw oFEUAgAAWwQAAA4AAAAAAAAAAAAAAAAALgIAAGRycy9lMm9Eb2MueG1sUEsBAi0AFAAGAAgAAAAh AEq/Dm/cAAAACgEAAA8AAAAAAAAAAAAAAAAAbgQAAGRycy9kb3ducmV2LnhtbFBLBQYAAAAABAAE APMAAAB3BQAAAAA= " path="m,l6147600,e" filled="f" strokecolor="#cad4e1" strokeweight=".65pt">
                 <v:path arrowok="t"/>
                 <w10:wrap type="topAndBottom" anchorx="page"/>
               </v:shape>
@@ -2562,7 +2291,7 @@
           </mc:Choice>
           <mc:Fallback>
             <w:pict>
-              <v:shape w14:anchorId="7B93DE48" id="Graphic 11" o:spid="_x0000_s1026" style="position:absolute;margin-left:55.6pt;margin-top:22.45pt;width:484.1pt;height:.1pt;z-index:-15726080;visibility:visible;mso-wrap-style:square;mso-wrap-distance-left:0;mso-wrap-distance-top:0;mso-wrap-distance-right:0;mso-wrap-distance-bottom:0;mso-position-horizontal:absolute;mso-position-horizontal-relative:page;mso-position-vertical:absolute;mso-position-vertical-relative:text;v-text-anchor:top" coordsize="6148070,1270" o:gfxdata="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" path="m,l6147600,e" filled="f" strokecolor="#cad4e1" strokeweight=".65pt">
+              <v:shape w14:anchorId="7B93DE48" id="Graphic 11" o:spid="_x0000_s1026" style="position:absolute;margin-left:55.6pt;margin-top:22.45pt;width:484.1pt;height:.1pt;z-index:-15726080;visibility:visible;mso-wrap-style:square;mso-wrap-distance-left:0;mso-wrap-distance-top:0;mso-wrap-distance-right:0;mso-wrap-distance-bottom:0;mso-position-horizontal:absolute;mso-position-horizontal-relative:page;mso-position-vertical:absolute;mso-position-vertical-relative:text;v-text-anchor:top" coordsize="6148070,1270" o:gfxdata="UEsDBBQABgAIAAAAIQC2gziS/gAAAOEBAAATAAAAW0NvbnRlbnRfVHlwZXNdLnhtbJSRQU7DMBBF 90jcwfIWJU67QAgl6YK0S0CoHGBkTxKLZGx5TGhvj5O2G0SRWNoz/78nu9wcxkFMGNg6quQqL6RA 0s5Y6ir5vt9lD1JwBDIwOMJKHpHlpr69KfdHjyxSmriSfYz+USnWPY7AufNIadK6MEJMx9ApD/oD OlTrorhX2lFEilmcO2RdNtjC5xDF9pCuTyYBB5bi6bQ4syoJ3g9WQ0ymaiLzg5KdCXlKLjvcW893 SUOqXwnz5DrgnHtJTxOsQfEKIT7DmDSUCaxw7Rqn8787ZsmRM9e2VmPeBN4uqYvTtW7jvijg9N/y JsXecLq0q+WD6m8AAAD//wMAUEsDBBQABgAIAAAAIQA4/SH/1gAAAJQBAAALAAAAX3JlbHMvLnJl bHOkkMFqwzAMhu+DvYPRfXGawxijTi+j0GvpHsDYimMaW0Yy2fr2M4PBMnrbUb/Q94l/f/hMi1qR JVI2sOt6UJgd+ZiDgffL8ekFlFSbvV0oo4EbChzGx4f9GRdb25HMsYhqlCwG5lrLq9biZkxWOiqY 22YiTra2kYMu1l1tQD30/bPm3wwYN0x18gb45AdQl1tp5j/sFB2T0FQ7R0nTNEV3j6o9feQzro1i OWA14Fm+Q8a1a8+Bvu/d/dMb2JY5uiPbhG/ktn4cqGU/er3pcvwCAAD//wMAUEsDBBQABgAIAAAA IQC0MKBRFAIAAFsEAAAOAAAAZHJzL2Uyb0RvYy54bWysVEtv2zAMvg/YfxB0X+wEbVoYcYoiWYcB RVegGXZWZDk2JosapcTOvx8lP5J1t2EXgRJp6ntQXj10jWYnha4Gk/P5LOVMGQlFbQ45/757+nTP mfPCFEKDUTk/K8cf1h8/rFqbqQVUoAuFjJoYl7U255X3NksSJyvVCDcDqwwlS8BGeNriISlQtNS9 0ckiTZdJC1hYBKmco9Ntn+Tr2L8slfTfytIpz3TOCZuPK8Z1H9ZkvRLZAYWtajnAEP+AohG1oUun VlvhBTti/VerppYIDko/k9AkUJa1VJEDsZmn79i8VcKqyIXEcXaSyf2/tvLl9GZfMUB39hnkT0eK JK112ZQJGzfUdCU2oZaAsy6qeJ5UVJ1nkg6X85v79I7ElpSbLygKLUU2fiuPzn9REPuI07PzvQfF GIlqjGRnxhDJyeChjh56zshD5Iw83PceWuHDdwFcCFl7ARLOGjipHcSsf4ecoF2y2lxXEZW7ZUpU RpZU21dQEK6JxKar6fCanDYBxf3i9jaOhgNdF0+11gGFw8N+o5GdBJHaPG5vPs8Hmf4os+j8Vriq r4upoUybwafemmDSHorzK7KWpjnn7tdRoOJMfzU0LmH0xwDHYD8G6PUG4gOJAtGdu+6HQMvC9Tn3 5OwLjMMostG0oMFUG7408Hj0UNbB0ThDPaJhQxMc5RpeW3gi1/tYdfknrH8DAAD//wMAUEsDBBQA BgAIAAAAIQChEIq43QAAAAoBAAAPAAAAZHJzL2Rvd25yZXYueG1sTI/LTsNADEX3SPzDyEhsUDtJ FKANmVQIUcGW0g9wMm4SdR4hM23Sv8ddwfLaR9fH5Wa2RpxpDL13CtJlAoJc43XvWgX77+1iBSJE dBqNd6TgQgE21e1NiYX2k/ui8y62gktcKFBBF+NQSBmajiyGpR/I8e7gR4uR49hKPeLE5dbILEme pMXe8YUOB3rrqDnuTlbB8afuTfgwEaeaVtv3z/0le0iUur+bX19ARJrjHwxXfVaHip1qf3I6CMM5 TTNGFeT5GsQVSJ7XOYiaJ48pyKqU/1+ofgEAAP//AwBQSwECLQAUAAYACAAAACEAtoM4kv4AAADh AQAAEwAAAAAAAAAAAAAAAAAAAAAAW0NvbnRlbnRfVHlwZXNdLnhtbFBLAQItABQABgAIAAAAIQA4 /SH/1gAAAJQBAAALAAAAAAAAAAAAAAAAAC8BAABfcmVscy8ucmVsc1BLAQItABQABgAIAAAAIQC0 MKBRFAIAAFsEAAAOAAAAAAAAAAAAAAAAAC4CAABkcnMvZTJvRG9jLnhtbFBLAQItABQABgAIAAAA IQChEIq43QAAAAoBAAAPAAAAAAAAAAAAAAAAAG4EAABkcnMvZG93bnJldi54bWxQSwUGAAAAAAQA BADzAAAAeAUAAAAA " path="m,l6147600,e" filled="f" strokecolor="#cad4e1" strokeweight=".65pt">
                 <v:path arrowok="t"/>
                 <w10:wrap type="topAndBottom" anchorx="page"/>
               </v:shape>
@@ -2656,25 +2385,7 @@
             <w:w w:val="110"/>
             <w:sz w:val="16"/>
           </w:rPr>
-          <w:t xml:space="preserve">Authentication and </w:t>
-        </w:r>
-        <w:proofErr w:type="spellStart"/>
-        <w:r>
-          <w:rPr>
-            <w:color w:val="111826"/>
-            <w:w w:val="110"/>
-            <w:sz w:val="16"/>
-          </w:rPr>
-          <w:t>Keycloak</w:t>
-        </w:r>
-        <w:proofErr w:type="spellEnd"/>
-        <w:r>
-          <w:rPr>
-            <w:color w:val="111826"/>
-            <w:w w:val="110"/>
-            <w:sz w:val="16"/>
-          </w:rPr>
-          <w:t xml:space="preserve"> (2023)</w:t>
+          <w:t xml:space="preserve">Authentication and Keycloak (2023)</w:t>
         </w:r>
       </w:hyperlink>
     </w:p>
@@ -2833,7 +2544,7 @@
           </mc:Choice>
           <mc:Fallback>
             <w:pict>
-              <v:shape w14:anchorId="3276F1D3" id="Graphic 12" o:spid="_x0000_s1026" style="position:absolute;margin-left:55.6pt;margin-top:23pt;width:484.1pt;height:.1pt;z-index:-15725568;visibility:visible;mso-wrap-style:square;mso-wrap-distance-left:0;mso-wrap-distance-top:0;mso-wrap-distance-right:0;mso-wrap-distance-bottom:0;mso-position-horizontal:absolute;mso-position-horizontal-relative:page;mso-position-vertical:absolute;mso-position-vertical-relative:text;v-text-anchor:top" coordsize="6148070,1270" o:gfxdata="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" path="m,l6147600,e" filled="f" strokecolor="#cad4e1" strokeweight=".65pt">
+              <v:shape w14:anchorId="3276F1D3" id="Graphic 12" o:spid="_x0000_s1026" style="position:absolute;margin-left:55.6pt;margin-top:23pt;width:484.1pt;height:.1pt;z-index:-15725568;visibility:visible;mso-wrap-style:square;mso-wrap-distance-left:0;mso-wrap-distance-top:0;mso-wrap-distance-right:0;mso-wrap-distance-bottom:0;mso-position-horizontal:absolute;mso-position-horizontal-relative:page;mso-position-vertical:absolute;mso-position-vertical-relative:text;v-text-anchor:top" coordsize="6148070,1270" o:gfxdata="UEsDBBQABgAIAAAAIQC2gziS/gAAAOEBAAATAAAAW0NvbnRlbnRfVHlwZXNdLnhtbJSRQU7DMBBF 90jcwfIWJU67QAgl6YK0S0CoHGBkTxKLZGx5TGhvj5O2G0SRWNoz/78nu9wcxkFMGNg6quQqL6RA 0s5Y6ir5vt9lD1JwBDIwOMJKHpHlpr69KfdHjyxSmriSfYz+USnWPY7AufNIadK6MEJMx9ApD/oD OlTrorhX2lFEilmcO2RdNtjC5xDF9pCuTyYBB5bi6bQ4syoJ3g9WQ0ymaiLzg5KdCXlKLjvcW893 SUOqXwnz5DrgnHtJTxOsQfEKIT7DmDSUCaxw7Rqn8787ZsmRM9e2VmPeBN4uqYvTtW7jvijg9N/y JsXecLq0q+WD6m8AAAD//wMAUEsDBBQABgAIAAAAIQA4/SH/1gAAAJQBAAALAAAAX3JlbHMvLnJl bHOkkMFqwzAMhu+DvYPRfXGawxijTi+j0GvpHsDYimMaW0Yy2fr2M4PBMnrbUb/Q94l/f/hMi1qR JVI2sOt6UJgd+ZiDgffL8ekFlFSbvV0oo4EbChzGx4f9GRdb25HMsYhqlCwG5lrLq9biZkxWOiqY 22YiTra2kYMu1l1tQD30/bPm3wwYN0x18gb45AdQl1tp5j/sFB2T0FQ7R0nTNEV3j6o9feQzro1i OWA14Fm+Q8a1a8+Bvu/d/dMb2JY5uiPbhG/ktn4cqGU/er3pcvwCAAD//wMAUEsDBBQABgAIAAAA IQC0MKBRFAIAAFsEAAAOAAAAZHJzL2Uyb0RvYy54bWysVEtv2zAMvg/YfxB0X+wEbVoYcYoiWYcB RVegGXZWZDk2JosapcTOvx8lP5J1t2EXgRJp6ntQXj10jWYnha4Gk/P5LOVMGQlFbQ45/757+nTP mfPCFEKDUTk/K8cf1h8/rFqbqQVUoAuFjJoYl7U255X3NksSJyvVCDcDqwwlS8BGeNriISlQtNS9 0ckiTZdJC1hYBKmco9Ntn+Tr2L8slfTfytIpz3TOCZuPK8Z1H9ZkvRLZAYWtajnAEP+AohG1oUun VlvhBTti/VerppYIDko/k9AkUJa1VJEDsZmn79i8VcKqyIXEcXaSyf2/tvLl9GZfMUB39hnkT0eK JK112ZQJGzfUdCU2oZaAsy6qeJ5UVJ1nkg6X85v79I7ElpSbLygKLUU2fiuPzn9REPuI07PzvQfF GIlqjGRnxhDJyeChjh56zshD5Iw83PceWuHDdwFcCFl7ARLOGjipHcSsf4ecoF2y2lxXEZW7ZUpU RpZU21dQEK6JxKar6fCanDYBxf3i9jaOhgNdF0+11gGFw8N+o5GdBJHaPG5vPs8Hmf4os+j8Vriq r4upoUybwafemmDSHorzK7KWpjnn7tdRoOJMfzU0LmH0xwDHYD8G6PUG4gOJAtGdu+6HQMvC9Tn3 5OwLjMMostG0oMFUG7408Hj0UNbB0ThDPaJhQxMc5RpeW3gi1/tYdfknrH8DAAD//wMAUEsDBBQA BgAIAAAAIQAmnEMo3AAAAAoBAAAPAAAAZHJzL2Rvd25yZXYueG1sTI/NTsMwEITvSLyDtZW4IOok qkpJ41QIUcGVtg+wiZckqn9C7Dbp27M5wXFmP83OFLvJGnGlIXTeKUiXCQhytdedaxScjvunDYgQ 0Wk03pGCGwXYlfd3Bebaj+6LrofYCA5xIUcFbYx9LmWoW7IYlr4nx7dvP1iMLIdG6gFHDrdGZkmy lhY7xx9a7Omtpfp8uFgF55+qM+HDRBwr2uzfP0+37DFR6mExvW5BRJriHwxzfa4OJXeq/MXpIAzr NM0YVbBa86YZSJ5fViCq2clAloX8P6H8BQAA//8DAFBLAQItABQABgAIAAAAIQC2gziS/gAAAOEB AAATAAAAAAAAAAAAAAAAAAAAAABbQ29udGVudF9UeXBlc10ueG1sUEsBAi0AFAAGAAgAAAAhADj9 If/WAAAAlAEAAAsAAAAAAAAAAAAAAAAALwEAAF9yZWxzLy5yZWxzUEsBAi0AFAAGAAgAAAAhALQw oFEUAgAAWwQAAA4AAAAAAAAAAAAAAAAALgIAAGRycy9lMm9Eb2MueG1sUEsBAi0AFAAGAAgAAAAh ACacQyjcAAAACgEAAA8AAAAAAAAAAAAAAAAAbgQAAGRycy9kb3ducmV2LnhtbFBLBQYAAAAABAAE APMAAAB3BQAAAAA= " path="m,l6147600,e" filled="f" strokecolor="#cad4e1" strokeweight=".65pt">
                 <v:path arrowok="t"/>
                 <w10:wrap type="topAndBottom" anchorx="page"/>
               </v:shape>

</xml_diff>